<commit_message>
docs: adiciona banner e atualiza o guia do Power BI com os nomes padronizados
Co-Authored-By: Claude Opus 5.5 <noreply@anthropic.com>
</commit_message>
<xml_diff>
--- a/projetos/powerbi/M5_PowerBI_Guia.docx
+++ b/projetos/powerbi/M5_PowerBI_Guia.docx
@@ -7,67 +7,7 @@
         <w:pStyle w:val="Title"/>
       </w:pPr>
       <w:r>
-        <w:t xml:space="preserve">Guia</w:t>
-      </w:r>
-      <w:r>
-        <w:t xml:space="preserve"> </w:t>
-      </w:r>
-      <w:r>
-        <w:t xml:space="preserve">de</w:t>
-      </w:r>
-      <w:r>
-        <w:t xml:space="preserve"> </w:t>
-      </w:r>
-      <w:r>
-        <w:t xml:space="preserve">construção</w:t>
-      </w:r>
-      <w:r>
-        <w:t xml:space="preserve"> </w:t>
-      </w:r>
-      <w:r>
-        <w:t xml:space="preserve">|</w:t>
-      </w:r>
-      <w:r>
-        <w:t xml:space="preserve"> </w:t>
-      </w:r>
-      <w:r>
-        <w:t xml:space="preserve">Painel</w:t>
-      </w:r>
-      <w:r>
-        <w:t xml:space="preserve"> </w:t>
-      </w:r>
-      <w:r>
-        <w:t xml:space="preserve">IFData</w:t>
-      </w:r>
-      <w:r>
-        <w:t xml:space="preserve"> </w:t>
-      </w:r>
-      <w:r>
-        <w:t xml:space="preserve">Junho</w:t>
-      </w:r>
-      <w:r>
-        <w:t xml:space="preserve"> </w:t>
-      </w:r>
-      <w:r>
-        <w:t xml:space="preserve">2026</w:t>
-      </w:r>
-      <w:r>
-        <w:t xml:space="preserve"> </w:t>
-      </w:r>
-      <w:r>
-        <w:t xml:space="preserve">no</w:t>
-      </w:r>
-      <w:r>
-        <w:t xml:space="preserve"> </w:t>
-      </w:r>
-      <w:r>
-        <w:t xml:space="preserve">Power</w:t>
-      </w:r>
-      <w:r>
-        <w:t xml:space="preserve"> </w:t>
-      </w:r>
-      <w:r>
-        <w:t xml:space="preserve">BI</w:t>
+        <w:t xml:space="preserve">Guia de construção | Dashboard IF.data Junho 2026 no Power BI (M5_Dashboard_IFdata.pbix)</w:t>
       </w:r>
     </w:p>
     <w:bookmarkStart w:id="20" w:name="quatro-alertas-antes-de-construir"/>
@@ -100,62 +40,10 @@
           <w:bCs/>
           <w:b/>
         </w:rPr>
-        <w:t xml:space="preserve">“</w:t>
-      </w:r>
-      <w:r>
-        <w:rPr>
-          <w:bCs/>
-          <w:b/>
-        </w:rPr>
-        <w:t xml:space="preserve">NI</w:t>
-      </w:r>
-      <w:r>
-        <w:rPr>
-          <w:bCs/>
-          <w:b/>
-        </w:rPr>
-        <w:t xml:space="preserve">”</w:t>
-      </w:r>
-      <w:r>
-        <w:rPr>
-          <w:bCs/>
-          <w:b/>
-        </w:rPr>
-        <w:t xml:space="preserve"> </w:t>
-      </w:r>
-      <w:r>
-        <w:rPr>
-          <w:bCs/>
-          <w:b/>
-        </w:rPr>
-        <w:t xml:space="preserve">em colunas numéricas.</w:t>
-      </w:r>
-      <w:r>
-        <w:t xml:space="preserve"> </w:t>
-      </w:r>
-      <w:r>
-        <w:t xml:space="preserve">51 instituições trazem o texto</w:t>
-      </w:r>
-      <w:r>
-        <w:t xml:space="preserve"> </w:t>
-      </w:r>
-      <w:r>
-        <w:t xml:space="preserve">“</w:t>
-      </w:r>
-      <w:r>
-        <w:t xml:space="preserve">NI</w:t>
-      </w:r>
-      <w:r>
-        <w:t xml:space="preserve">”</w:t>
-      </w:r>
-      <w:r>
-        <w:t xml:space="preserve"> </w:t>
-      </w:r>
-      <w:r>
-        <w:t xml:space="preserve">(não informado) em Ativo, Crédito, PL e Lucro. Se você importar sem tratar, o Power BI lê essas colunas como texto e o</w:t>
-      </w:r>
-      <w:r>
-        <w:t xml:space="preserve"> </w:t>
+        <w:t xml:space="preserve">“NI” em colunas numéricas.</w:t>
+      </w:r>
+      <w:r>
+        <w:t xml:space="preserve"> 51 instituições trazem o texto “NI” (não informado) em Ativo, Crédito, PL e Lucro. Se você importar sem tratar, o Power BI lê essas colunas como texto e o </w:t>
       </w:r>
       <w:r>
         <w:rPr>
@@ -164,28 +52,7 @@
         <w:t xml:space="preserve">SUM</w:t>
       </w:r>
       <w:r>
-        <w:t xml:space="preserve"> </w:t>
-      </w:r>
-      <w:r>
-        <w:t xml:space="preserve">falha. O script de Power Query abaixo troca</w:t>
-      </w:r>
-      <w:r>
-        <w:t xml:space="preserve"> </w:t>
-      </w:r>
-      <w:r>
-        <w:t xml:space="preserve">“</w:t>
-      </w:r>
-      <w:r>
-        <w:t xml:space="preserve">NI</w:t>
-      </w:r>
-      <w:r>
-        <w:t xml:space="preserve">”</w:t>
-      </w:r>
-      <w:r>
-        <w:t xml:space="preserve"> </w:t>
-      </w:r>
-      <w:r>
-        <w:t xml:space="preserve">por vazio. Essas 51 entram nas contagens e ficam fora de somas e médias, como diz o dicionário da base.</w:t>
+        <w:t xml:space="preserve"> falha. O script de Power Query abaixo troca “NI” por vazio. Essas 51 entram nas contagens e ficam fora de somas e médias, como diz o dicionário da base.</w:t>
       </w:r>
     </w:p>
     <w:p>
@@ -201,76 +68,10 @@
           <w:bCs/>
           <w:b/>
         </w:rPr>
-        <w:t xml:space="preserve">“</w:t>
-      </w:r>
-      <w:r>
-        <w:rPr>
-          <w:bCs/>
-          <w:b/>
-        </w:rPr>
-        <w:t xml:space="preserve">Sem agência</w:t>
-      </w:r>
-      <w:r>
-        <w:rPr>
-          <w:bCs/>
-          <w:b/>
-        </w:rPr>
-        <w:t xml:space="preserve">”</w:t>
-      </w:r>
-      <w:r>
-        <w:rPr>
-          <w:bCs/>
-          <w:b/>
-        </w:rPr>
-        <w:t xml:space="preserve"> </w:t>
-      </w:r>
-      <w:r>
-        <w:rPr>
-          <w:bCs/>
-          <w:b/>
-        </w:rPr>
-        <w:t xml:space="preserve">não significa</w:t>
-      </w:r>
-      <w:r>
-        <w:rPr>
-          <w:bCs/>
-          <w:b/>
-        </w:rPr>
-        <w:t xml:space="preserve"> </w:t>
-      </w:r>
-      <w:r>
-        <w:rPr>
-          <w:bCs/>
-          <w:b/>
-        </w:rPr>
-        <w:t xml:space="preserve">“</w:t>
-      </w:r>
-      <w:r>
-        <w:rPr>
-          <w:bCs/>
-          <w:b/>
-        </w:rPr>
-        <w:t xml:space="preserve">digital</w:t>
-      </w:r>
-      <w:r>
-        <w:rPr>
-          <w:bCs/>
-          <w:b/>
-        </w:rPr>
-        <w:t xml:space="preserve">”</w:t>
-      </w:r>
-      <w:r>
-        <w:rPr>
-          <w:bCs/>
-          <w:b/>
-        </w:rPr>
-        <w:t xml:space="preserve">.</w:t>
-      </w:r>
-      <w:r>
-        <w:t xml:space="preserve"> </w:t>
-      </w:r>
-      <w:r>
-        <w:t xml:space="preserve">As 756 instituições com zero agência são exatamente as cooperativas singulares (729) e centrais (27). Nenhum banco, não bancário ou instituição de pagamento tem zero agência na fonte (o mínimo é 1, provavelmente a sede). O cartão pedido (</w:t>
+        <w:t xml:space="preserve">“Sem agência” não significa “digital”.</w:t>
+      </w:r>
+      <w:r>
+        <w:t xml:space="preserve"> As 756 instituições com zero agência são exatamente as cooperativas singulares (729) e centrais (27). Nenhum banco, não bancário ou instituição de pagamento tem zero agência na fonte (o mínimo é 1, provavelmente a sede). O cartão pedido (</w:t>
       </w:r>
       <w:r>
         <w:rPr>
@@ -279,25 +80,7 @@
         <w:t xml:space="preserve">Qtd sem Agência</w:t>
       </w:r>
       <w:r>
-        <w:t xml:space="preserve">) mostrará 756, mas o título</w:t>
-      </w:r>
-      <w:r>
-        <w:t xml:space="preserve"> </w:t>
-      </w:r>
-      <w:r>
-        <w:t xml:space="preserve">“</w:t>
-      </w:r>
-      <w:r>
-        <w:t xml:space="preserve">digitais</w:t>
-      </w:r>
-      <w:r>
-        <w:t xml:space="preserve">”</w:t>
-      </w:r>
-      <w:r>
-        <w:t xml:space="preserve"> </w:t>
-      </w:r>
-      <w:r>
-        <w:t xml:space="preserve">seria enganoso. Entreguei a medida pedida e uma alternativa (</w:t>
+        <w:t xml:space="preserve">) mostrará 756, mas o título “digitais” seria enganoso. Entreguei a medida pedida e uma alternativa (</w:t>
       </w:r>
       <w:r>
         <w:rPr>
@@ -325,13 +108,7 @@
         <w:t xml:space="preserve">A base não tem coluna de Segmento S1 a S5.</w:t>
       </w:r>
       <w:r>
-        <w:t xml:space="preserve"> </w:t>
-      </w:r>
-      <w:r>
-        <w:t xml:space="preserve">Ela tem apenas</w:t>
-      </w:r>
-      <w:r>
-        <w:t xml:space="preserve"> </w:t>
+        <w:t xml:space="preserve"> Ela tem apenas </w:t>
       </w:r>
       <w:r>
         <w:rPr>
@@ -340,13 +117,7 @@
         <w:t xml:space="preserve">Porte</w:t>
       </w:r>
       <w:r>
-        <w:t xml:space="preserve"> </w:t>
-      </w:r>
-      <w:r>
-        <w:t xml:space="preserve">(Grande ou Média/Pequena). O segmento prudencial do Banco Central (Res. CMN 4.553) depende do ativo em proporção ao PIB (S1 a partir de 10%, S2 de 1% a 10%, S3 de 0,1% a 1%, S4 abaixo de 0,1%) e de critérios que a base não traz, como atividade internacional e opção pela apuração simplificada (S5). Criei uma</w:t>
-      </w:r>
-      <w:r>
-        <w:t xml:space="preserve"> </w:t>
+        <w:t xml:space="preserve"> (Grande ou Média/Pequena). O segmento prudencial do Banco Central (Res. CMN 4.553) depende do ativo em proporção ao PIB (S1 a partir de 10%, S2 de 1% a 10%, S3 de 0,1% a 1%, S4 abaixo de 0,1%) e de critérios que a base não traz, como atividade internacional e opção pela apuração simplificada (S5). Criei uma </w:t>
       </w:r>
       <w:r>
         <w:rPr>
@@ -356,10 +127,7 @@
         <w:t xml:space="preserve">aproximação por Ativo ÷ PIB</w:t>
       </w:r>
       <w:r>
-        <w:t xml:space="preserve"> </w:t>
-      </w:r>
-      <w:r>
-        <w:t xml:space="preserve">no Power Query, com PIB parametrizado em R$ 13 tri (premissa minha, ajuste ao PIB nominal que preferir). S5 é aproximado como cooperativa singular abaixo de 0,1% do PIB. A classificação oficial pode divergir (por exemplo, o Santander cai em S2 na aproximação). Se você tiver a lista oficial, importe-a e relacione por Código.</w:t>
+        <w:t xml:space="preserve"> no Power Query, com PIB parametrizado em R$ 13 tri (premissa minha, ajuste ao PIB nominal que preferir). S5 é aproximado como cooperativa singular abaixo de 0,1% do PIB. A classificação oficial pode divergir (por exemplo, o Santander cai em S2 na aproximação). Se você tiver a lista oficial, importe-a e relacione por Código.</w:t>
       </w:r>
     </w:p>
     <w:p>
@@ -378,13 +146,7 @@
         <w:t xml:space="preserve">O layout não comporta dois dos seis visuais.</w:t>
       </w:r>
       <w:r>
-        <w:t xml:space="preserve"> </w:t>
-      </w:r>
-      <w:r>
-        <w:t xml:space="preserve">A tabela de perguntas pede coluna (ROE por segmento) e dispersão (crédito x ativo), mas a estrutura recomendada só desenha cartões, barras, rosca, tabela e segmentações. Proponho</w:t>
-      </w:r>
-      <w:r>
-        <w:t xml:space="preserve"> </w:t>
+        <w:t xml:space="preserve"> A tabela de perguntas pede coluna (ROE por segmento) e dispersão (crédito x ativo), mas a estrutura recomendada só desenha cartões, barras, rosca, tabela e segmentações. Proponho </w:t>
       </w:r>
       <w:r>
         <w:rPr>
@@ -394,19 +156,7 @@
         <w:t xml:space="preserve">duas páginas</w:t>
       </w:r>
       <w:r>
-        <w:t xml:space="preserve">: Página 1 segue a estrutura recomendada; Página 2 (</w:t>
-      </w:r>
-      <w:r>
-        <w:t xml:space="preserve">“</w:t>
-      </w:r>
-      <w:r>
-        <w:t xml:space="preserve">Rentabilidade e crédito</w:t>
-      </w:r>
-      <w:r>
-        <w:t xml:space="preserve">”</w:t>
-      </w:r>
-      <w:r>
-        <w:t xml:space="preserve">) recebe coluna e dispersão, com as segmentações sincronizadas.</w:t>
+        <w:t xml:space="preserve">: Página 1 segue a estrutura recomendada; Página 2 (“Rentabilidade e crédito”) recebe coluna e dispersão, com as segmentações sincronizadas.</w:t>
       </w:r>
     </w:p>
     <w:p>
@@ -414,28 +164,7 @@
         <w:pStyle w:val="FirstParagraph"/>
       </w:pPr>
       <w:r>
-        <w:t xml:space="preserve">Dois cuidados de leitura: o Ativo Total de R$ 19,50 tri soma instituições individuais e pode conter sobreposição entre holding e controladas (nota 3 do dicionário; Itaú Unibanco S.A. e Itaú Unibanco Holding aparecem ambos no Top 10). E o</w:t>
-      </w:r>
-      <w:r>
-        <w:t xml:space="preserve"> </w:t>
-      </w:r>
-      <w:r>
-        <w:t xml:space="preserve">“</w:t>
-      </w:r>
-      <w:r>
-        <w:t xml:space="preserve">ROE Médio</w:t>
-      </w:r>
-      <w:r>
-        <w:t xml:space="preserve">”</w:t>
-      </w:r>
-      <w:r>
-        <w:t xml:space="preserve"> </w:t>
-      </w:r>
-      <w:r>
-        <w:t xml:space="preserve">do cartão usa o ROE agregado (Lucro ÷ PL = 7,52%), como a orientação pede com</w:t>
-      </w:r>
-      <w:r>
-        <w:t xml:space="preserve"> </w:t>
+        <w:t xml:space="preserve">Dois cuidados de leitura: o Ativo Total de R$ 19,50 tri soma instituições individuais e pode conter sobreposição entre holding e controladas (nota 3 do dicionário; Itaú Unibanco S.A. e Itaú Unibanco Holding aparecem ambos no Top 10). E o “ROE Médio” do cartão usa o ROE agregado (Lucro ÷ PL = 7,52%), como a orientação pede com </w:t>
       </w:r>
       <w:r>
         <w:rPr>
@@ -466,10 +195,7 @@
         <w:pStyle w:val="Compact"/>
       </w:pPr>
       <w:r>
-        <w:t xml:space="preserve">Power BI Desktop &gt;</w:t>
-      </w:r>
-      <w:r>
-        <w:t xml:space="preserve"> </w:t>
+        <w:t xml:space="preserve">Power BI Desktop &gt; </w:t>
       </w:r>
       <w:r>
         <w:rPr>
@@ -479,28 +205,16 @@
         <w:t xml:space="preserve">Obter dados &gt; Pasta de Trabalho do Excel</w:t>
       </w:r>
       <w:r>
-        <w:t xml:space="preserve"> </w:t>
-      </w:r>
-      <w:r>
-        <w:t xml:space="preserve">&gt; selecione</w:t>
-      </w:r>
-      <w:r>
-        <w:t xml:space="preserve"> </w:t>
-      </w:r>
-      <w:r>
-        <w:rPr>
-          <w:rStyle w:val="VerbatimChar"/>
-        </w:rPr>
-        <w:t xml:space="preserve">Analise_IFData_Junho_2026.xlsx</w:t>
-      </w:r>
-      <w:r>
-        <w:t xml:space="preserve"> </w:t>
-      </w:r>
-      <w:r>
-        <w:t xml:space="preserve">&gt; marque</w:t>
-      </w:r>
-      <w:r>
-        <w:t xml:space="preserve"> </w:t>
+        <w:t xml:space="preserve"> &gt; selecione a planilha do projeto Excel, </w:t>
+      </w:r>
+      <w:r>
+        <w:rPr>
+          <w:rStyle w:val="VerbatimChar"/>
+        </w:rPr>
+        <w:t xml:space="preserve">M3_IFdata_Exercicios.xlsx</w:t>
+      </w:r>
+      <w:r>
+        <w:t xml:space="preserve"> &gt; marque </w:t>
       </w:r>
       <w:r>
         <w:rPr>
@@ -509,13 +223,7 @@
         <w:t xml:space="preserve">Base_IFData_Original</w:t>
       </w:r>
       <w:r>
-        <w:t xml:space="preserve"> </w:t>
-      </w:r>
-      <w:r>
-        <w:t xml:space="preserve">&gt;</w:t>
-      </w:r>
-      <w:r>
-        <w:t xml:space="preserve"> </w:t>
+        <w:t xml:space="preserve"> &gt; </w:t>
       </w:r>
       <w:r>
         <w:rPr>
@@ -537,10 +245,7 @@
         <w:pStyle w:val="Compact"/>
       </w:pPr>
       <w:r>
-        <w:t xml:space="preserve">No Power Query:</w:t>
-      </w:r>
-      <w:r>
-        <w:t xml:space="preserve"> </w:t>
+        <w:t xml:space="preserve">No Power Query: </w:t>
       </w:r>
       <w:r>
         <w:rPr>
@@ -550,22 +255,16 @@
         <w:t xml:space="preserve">Página Inicial &gt; Editor Avançado</w:t>
       </w:r>
       <w:r>
-        <w:t xml:space="preserve">, apague o conteúdo e cole o script de</w:t>
-      </w:r>
-      <w:r>
-        <w:t xml:space="preserve"> </w:t>
-      </w:r>
-      <w:r>
-        <w:rPr>
-          <w:rStyle w:val="VerbatimChar"/>
-        </w:rPr>
-        <w:t xml:space="preserve">Power_Query_IFData.m</w:t>
-      </w:r>
-      <w:r>
-        <w:t xml:space="preserve">. Troque</w:t>
-      </w:r>
-      <w:r>
-        <w:t xml:space="preserve"> </w:t>
+        <w:t xml:space="preserve">, apague o conteúdo e cole o script de </w:t>
+      </w:r>
+      <w:r>
+        <w:rPr>
+          <w:rStyle w:val="VerbatimChar"/>
+        </w:rPr>
+        <w:t xml:space="preserve">M5_Power_Query_IFdata.m</w:t>
+      </w:r>
+      <w:r>
+        <w:t xml:space="preserve">. Troque </w:t>
       </w:r>
       <w:r>
         <w:rPr>
@@ -574,13 +273,7 @@
         <w:t xml:space="preserve">C:\CAMINHO\...</w:t>
       </w:r>
       <w:r>
-        <w:t xml:space="preserve"> </w:t>
-      </w:r>
-      <w:r>
-        <w:t xml:space="preserve">pelo caminho real e ajuste</w:t>
-      </w:r>
-      <w:r>
-        <w:t xml:space="preserve"> </w:t>
+        <w:t xml:space="preserve"> pelo caminho real e ajuste </w:t>
       </w:r>
       <w:r>
         <w:rPr>
@@ -589,10 +282,7 @@
         <w:t xml:space="preserve">PIB_mil</w:t>
       </w:r>
       <w:r>
-        <w:t xml:space="preserve"> </w:t>
-      </w:r>
-      <w:r>
-        <w:t xml:space="preserve">se quiser.</w:t>
+        <w:t xml:space="preserve"> se quiser.</w:t>
       </w:r>
     </w:p>
     <w:p>
@@ -604,10 +294,7 @@
         <w:pStyle w:val="Compact"/>
       </w:pPr>
       <w:r>
-        <w:t xml:space="preserve">Renomeie a consulta para</w:t>
-      </w:r>
-      <w:r>
-        <w:t xml:space="preserve"> </w:t>
+        <w:t xml:space="preserve">Renomeie a consulta para </w:t>
       </w:r>
       <w:r>
         <w:rPr>
@@ -616,10 +303,7 @@
         <w:t xml:space="preserve">ifdata</w:t>
       </w:r>
       <w:r>
-        <w:t xml:space="preserve">. Confira se</w:t>
-      </w:r>
-      <w:r>
-        <w:t xml:space="preserve"> </w:t>
+        <w:t xml:space="preserve">. Confira se </w:t>
       </w:r>
       <w:r>
         <w:rPr>
@@ -628,10 +312,7 @@
         <w:t xml:space="preserve">ativo_total</w:t>
       </w:r>
       <w:r>
-        <w:t xml:space="preserve">,</w:t>
-      </w:r>
-      <w:r>
-        <w:t xml:space="preserve"> </w:t>
+        <w:t xml:space="preserve">, </w:t>
       </w:r>
       <w:r>
         <w:rPr>
@@ -640,10 +321,7 @@
         <w:t xml:space="preserve">carteira_credito</w:t>
       </w:r>
       <w:r>
-        <w:t xml:space="preserve">,</w:t>
-      </w:r>
-      <w:r>
-        <w:t xml:space="preserve"> </w:t>
+        <w:t xml:space="preserve">, </w:t>
       </w:r>
       <w:r>
         <w:rPr>
@@ -652,13 +330,7 @@
         <w:t xml:space="preserve">patrimonio_liquido</w:t>
       </w:r>
       <w:r>
-        <w:t xml:space="preserve"> </w:t>
-      </w:r>
-      <w:r>
-        <w:t xml:space="preserve">e</w:t>
-      </w:r>
-      <w:r>
-        <w:t xml:space="preserve"> </w:t>
+        <w:t xml:space="preserve"> e </w:t>
       </w:r>
       <w:r>
         <w:rPr>
@@ -667,10 +339,7 @@
         <w:t xml:space="preserve">lucro_liquido</w:t>
       </w:r>
       <w:r>
-        <w:t xml:space="preserve"> </w:t>
-      </w:r>
-      <w:r>
-        <w:t xml:space="preserve">aparecem com ícone numérico (1,2) e se não há erros.</w:t>
+        <w:t xml:space="preserve"> aparecem com ícone numérico (1,2) e se não há erros.</w:t>
       </w:r>
     </w:p>
     <w:p>
@@ -701,10 +370,7 @@
         <w:pStyle w:val="Compact"/>
       </w:pPr>
       <w:r>
-        <w:t xml:space="preserve">Crie a tabela de medidas:</w:t>
-      </w:r>
-      <w:r>
-        <w:t xml:space="preserve"> </w:t>
+        <w:t xml:space="preserve">Crie a tabela de medidas: </w:t>
       </w:r>
       <w:r>
         <w:rPr>
@@ -714,10 +380,7 @@
         <w:t xml:space="preserve">Inserir dados &gt; Tabela vazia</w:t>
       </w:r>
       <w:r>
-        <w:t xml:space="preserve">, nome</w:t>
-      </w:r>
-      <w:r>
-        <w:t xml:space="preserve"> </w:t>
+        <w:t xml:space="preserve">, nome </w:t>
       </w:r>
       <w:r>
         <w:rPr>
@@ -726,22 +389,16 @@
         <w:t xml:space="preserve">_Medidas</w:t>
       </w:r>
       <w:r>
-        <w:t xml:space="preserve">. Para cada medida de</w:t>
-      </w:r>
-      <w:r>
-        <w:t xml:space="preserve"> </w:t>
-      </w:r>
-      <w:r>
-        <w:rPr>
-          <w:rStyle w:val="VerbatimChar"/>
-        </w:rPr>
-        <w:t xml:space="preserve">Medidas_DAX_IFData.dax</w:t>
-      </w:r>
-      <w:r>
-        <w:t xml:space="preserve">:</w:t>
-      </w:r>
-      <w:r>
-        <w:t xml:space="preserve"> </w:t>
+        <w:t xml:space="preserve">. Para cada medida de </w:t>
+      </w:r>
+      <w:r>
+        <w:rPr>
+          <w:rStyle w:val="VerbatimChar"/>
+        </w:rPr>
+        <w:t xml:space="preserve">M5_Medidas_DAX_IFdata.dax</w:t>
+      </w:r>
+      <w:r>
+        <w:t xml:space="preserve">: </w:t>
       </w:r>
       <w:r>
         <w:rPr>
@@ -835,10 +492,7 @@
               <w:jc w:val="left"/>
             </w:pPr>
             <w:r>
-              <w:t xml:space="preserve">Decimal, 2 casas, prefixo personalizado</w:t>
-            </w:r>
-            <w:r>
-              <w:t xml:space="preserve"> </w:t>
+              <w:t xml:space="preserve">Decimal, 2 casas, prefixo personalizado </w:t>
             </w:r>
             <w:r>
               <w:rPr>
@@ -876,22 +530,7 @@
               <w:t xml:space="preserve">#,0</w:t>
             </w:r>
             <w:r>
-              <w:t xml:space="preserve"> </w:t>
-            </w:r>
-            <w:r>
-              <w:t xml:space="preserve">com sufixo</w:t>
-            </w:r>
-            <w:r>
-              <w:t xml:space="preserve"> </w:t>
-            </w:r>
-            <w:r>
-              <w:t xml:space="preserve">“</w:t>
-            </w:r>
-            <w:r>
-              <w:t xml:space="preserve">bi</w:t>
-            </w:r>
-            <w:r>
-              <w:t xml:space="preserve">”</w:t>
+              <w:t xml:space="preserve"> com sufixo “bi”</w:t>
             </w:r>
           </w:p>
         </w:tc>
@@ -964,16 +603,13 @@
         <w:pStyle w:val="FirstParagraph"/>
       </w:pPr>
       <w:r>
-        <w:t xml:space="preserve">O conteúdo completo, comentado e pronto para colar, está em</w:t>
-      </w:r>
-      <w:r>
-        <w:t xml:space="preserve"> </w:t>
-      </w:r>
-      <w:r>
-        <w:rPr>
-          <w:rStyle w:val="VerbatimChar"/>
-        </w:rPr>
-        <w:t xml:space="preserve">Medidas_DAX_IFData.dax</w:t>
+        <w:t xml:space="preserve">O conteúdo completo, comentado e pronto para colar, está em </w:t>
+      </w:r>
+      <w:r>
+        <w:rPr>
+          <w:rStyle w:val="VerbatimChar"/>
+        </w:rPr>
+        <w:t xml:space="preserve">M5_Medidas_DAX_IFdata.dax</w:t>
       </w:r>
       <w:r>
         <w:t xml:space="preserve">. Resumo:</w:t>
@@ -1112,13 +748,7 @@
               <w:t xml:space="preserve">DIVIDE([Ativo Total], 1000000000)</w:t>
             </w:r>
             <w:r>
-              <w:t xml:space="preserve"> </w:t>
-            </w:r>
-            <w:r>
-              <w:t xml:space="preserve">e</w:t>
-            </w:r>
-            <w:r>
-              <w:t xml:space="preserve"> </w:t>
+              <w:t xml:space="preserve"> e </w:t>
             </w:r>
             <w:r>
               <w:rPr>
@@ -1414,13 +1044,7 @@
               <w:t xml:space="preserve">RANKX(ALLSELECTED(ifdata[instituicao]), [Ativo Total], , DESC, DENSE)</w:t>
             </w:r>
             <w:r>
-              <w:t xml:space="preserve"> </w:t>
-            </w:r>
-            <w:r>
-              <w:t xml:space="preserve">e</w:t>
-            </w:r>
-            <w:r>
-              <w:t xml:space="preserve"> </w:t>
+              <w:t xml:space="preserve"> e </w:t>
             </w:r>
             <w:r>
               <w:rPr>
@@ -1511,10 +1135,7 @@
               <w:t xml:space="preserve">SUMX(TOPN(5, ALLSELECTED(ifdata), ifdata[ativo_total], DESC), ifdata[ativo_total])</w:t>
             </w:r>
             <w:r>
-              <w:t xml:space="preserve"> </w:t>
-            </w:r>
-            <w:r>
-              <w:t xml:space="preserve">dividido pelo ativo total selecionado</w:t>
+              <w:t xml:space="preserve"> dividido pelo ativo total selecionado</w:t>
             </w:r>
           </w:p>
         </w:tc>
@@ -1525,10 +1146,7 @@
         <w:pStyle w:val="BodyText"/>
       </w:pPr>
       <w:r>
-        <w:t xml:space="preserve">Medidas-base de apoio:</w:t>
-      </w:r>
-      <w:r>
-        <w:t xml:space="preserve"> </w:t>
+        <w:t xml:space="preserve">Medidas-base de apoio: </w:t>
       </w:r>
       <w:r>
         <w:rPr>
@@ -1537,10 +1155,7 @@
         <w:t xml:space="preserve">Carteira de Crédito</w:t>
       </w:r>
       <w:r>
-        <w:t xml:space="preserve">,</w:t>
-      </w:r>
-      <w:r>
-        <w:t xml:space="preserve"> </w:t>
+        <w:t xml:space="preserve">, </w:t>
       </w:r>
       <w:r>
         <w:rPr>
@@ -1549,13 +1164,7 @@
         <w:t xml:space="preserve">Patrimônio Líquido</w:t>
       </w:r>
       <w:r>
-        <w:t xml:space="preserve"> </w:t>
-      </w:r>
-      <w:r>
-        <w:t xml:space="preserve">e</w:t>
-      </w:r>
-      <w:r>
-        <w:t xml:space="preserve"> </w:t>
+        <w:t xml:space="preserve"> e </w:t>
       </w:r>
       <w:r>
         <w:rPr>
@@ -1564,10 +1173,7 @@
         <w:t xml:space="preserve">Lucro Líquido</w:t>
       </w:r>
       <w:r>
-        <w:t xml:space="preserve">, todas</w:t>
-      </w:r>
-      <w:r>
-        <w:t xml:space="preserve"> </w:t>
+        <w:t xml:space="preserve">, todas </w:t>
       </w:r>
       <w:r>
         <w:rPr>
@@ -1576,10 +1182,7 @@
         <w:t xml:space="preserve">SUM</w:t>
       </w:r>
       <w:r>
-        <w:t xml:space="preserve"> </w:t>
-      </w:r>
-      <w:r>
-        <w:t xml:space="preserve">da coluna correspondente.</w:t>
+        <w:t xml:space="preserve"> da coluna correspondente.</w:t>
       </w:r>
     </w:p>
     <w:bookmarkEnd w:id="22"/>
@@ -1604,22 +1207,23 @@
         <w:t xml:space="preserve">Configuração da página:</w:t>
       </w:r>
       <w:r>
-        <w:t xml:space="preserve"> </w:t>
-      </w:r>
-      <w:r>
-        <w:t xml:space="preserve">Exibir &gt; Tamanho da página 16:9 (1280 x 720). Plano de fundo cinza muito claro (#F4F6FA). Título no topo:</w:t>
-      </w:r>
-      <w:r>
-        <w:t xml:space="preserve"> </w:t>
-      </w:r>
-      <w:r>
-        <w:t xml:space="preserve">“</w:t>
-      </w:r>
-      <w:r>
-        <w:t xml:space="preserve">Sistema financeiro brasileiro | Junho 2026 | Fonte: IF.data, Banco Central</w:t>
-      </w:r>
-      <w:r>
-        <w:t xml:space="preserve">”</w:t>
+        <w:t xml:space="preserve"> Exibir &gt; Tamanho da página 16:9 (1280 x 720). Plano de fundo cinza muito claro (#F4F6FA). Título no topo: “Sistema financeiro brasileiro | Junho 2026 | Fonte: IF.data, Banco Central”. Aplique o tema de cores em </w:t>
+      </w:r>
+      <w:r>
+        <w:rPr>
+          <w:b/>
+          <w:bCs/>
+        </w:rPr>
+        <w:t xml:space="preserve">Exibir &gt; Temas &gt; Procurar temas</w:t>
+      </w:r>
+      <w:r>
+        <w:t xml:space="preserve">, selecionando </w:t>
+      </w:r>
+      <w:r>
+        <w:rPr>
+          <w:rStyle w:val="VerbatimChar"/>
+        </w:rPr>
+        <w:t xml:space="preserve">M5_Tema_IFdata.json</w:t>
       </w:r>
       <w:r>
         <w:t xml:space="preserve">.</w:t>
@@ -1637,13 +1241,7 @@
         <w:t xml:space="preserve">Paleta:</w:t>
       </w:r>
       <w:r>
-        <w:t xml:space="preserve"> </w:t>
-      </w:r>
-      <w:r>
-        <w:t xml:space="preserve">Navy</w:t>
-      </w:r>
-      <w:r>
-        <w:t xml:space="preserve"> </w:t>
+        <w:t xml:space="preserve"> Navy </w:t>
       </w:r>
       <w:r>
         <w:rPr>
@@ -1652,13 +1250,7 @@
         <w:t xml:space="preserve">#1F3A6E</w:t>
       </w:r>
       <w:r>
-        <w:t xml:space="preserve"> </w:t>
-      </w:r>
-      <w:r>
-        <w:t xml:space="preserve">(destaque e Público), Teal</w:t>
-      </w:r>
-      <w:r>
-        <w:t xml:space="preserve"> </w:t>
+        <w:t xml:space="preserve"> (destaque e Público), Teal </w:t>
       </w:r>
       <w:r>
         <w:rPr>
@@ -1667,13 +1259,7 @@
         <w:t xml:space="preserve">#2A9D8F</w:t>
       </w:r>
       <w:r>
-        <w:t xml:space="preserve"> </w:t>
-      </w:r>
-      <w:r>
-        <w:t xml:space="preserve">(Privado Nacional), Teal claro</w:t>
-      </w:r>
-      <w:r>
-        <w:t xml:space="preserve"> </w:t>
+        <w:t xml:space="preserve"> (Privado Nacional), Teal claro </w:t>
       </w:r>
       <w:r>
         <w:rPr>
@@ -1682,13 +1268,7 @@
         <w:t xml:space="preserve">#9AD3CB</w:t>
       </w:r>
       <w:r>
-        <w:t xml:space="preserve"> </w:t>
-      </w:r>
-      <w:r>
-        <w:t xml:space="preserve">(Privado Estrangeiro), cinza-azulado</w:t>
-      </w:r>
-      <w:r>
-        <w:t xml:space="preserve"> </w:t>
+        <w:t xml:space="preserve"> (Privado Estrangeiro), cinza-azulado </w:t>
       </w:r>
       <w:r>
         <w:rPr>
@@ -1697,10 +1277,7 @@
         <w:t xml:space="preserve">#9FB1CF</w:t>
       </w:r>
       <w:r>
-        <w:t xml:space="preserve"> </w:t>
-      </w:r>
-      <w:r>
-        <w:t xml:space="preserve">(barras secundárias).</w:t>
+        <w:t xml:space="preserve"> (barras secundárias).</w:t>
       </w:r>
     </w:p>
     <w:tbl>
@@ -1952,10 +1529,7 @@
         <w:pStyle w:val="BodyText"/>
       </w:pPr>
       <w:r>
-        <w:t xml:space="preserve">Ajuste cada posição em</w:t>
-      </w:r>
-      <w:r>
-        <w:t xml:space="preserve"> </w:t>
+        <w:t xml:space="preserve">Ajuste cada posição em </w:t>
       </w:r>
       <w:r>
         <w:rPr>
@@ -1982,10 +1556,7 @@
         <w:pStyle w:val="FirstParagraph"/>
       </w:pPr>
       <w:r>
-        <w:t xml:space="preserve">Insira</w:t>
-      </w:r>
-      <w:r>
-        <w:t xml:space="preserve"> </w:t>
+        <w:t xml:space="preserve">Insira </w:t>
       </w:r>
       <w:r>
         <w:rPr>
@@ -1995,10 +1566,7 @@
         <w:t xml:space="preserve">Cartão</w:t>
       </w:r>
       <w:r>
-        <w:t xml:space="preserve"> </w:t>
-      </w:r>
-      <w:r>
-        <w:t xml:space="preserve">(ou Cartão novo) quatro vezes.</w:t>
+        <w:t xml:space="preserve"> (ou Cartão novo) quatro vezes.</w:t>
       </w:r>
     </w:p>
     <w:p>
@@ -2017,13 +1585,7 @@
         <w:t xml:space="preserve">Ativo Total:</w:t>
       </w:r>
       <w:r>
-        <w:t xml:space="preserve"> </w:t>
-      </w:r>
-      <w:r>
-        <w:t xml:space="preserve">campo</w:t>
-      </w:r>
-      <w:r>
-        <w:t xml:space="preserve"> </w:t>
+        <w:t xml:space="preserve"> campo </w:t>
       </w:r>
       <w:r>
         <w:rPr>
@@ -2032,22 +1594,7 @@
         <w:t xml:space="preserve">Ativo Total (R$ tri)</w:t>
       </w:r>
       <w:r>
-        <w:t xml:space="preserve">. Rótulo de categoria</w:t>
-      </w:r>
-      <w:r>
-        <w:t xml:space="preserve"> </w:t>
-      </w:r>
-      <w:r>
-        <w:t xml:space="preserve">“</w:t>
-      </w:r>
-      <w:r>
-        <w:t xml:space="preserve">Ativo total do sistema</w:t>
-      </w:r>
-      <w:r>
-        <w:t xml:space="preserve">”</w:t>
-      </w:r>
-      <w:r>
-        <w:t xml:space="preserve">. Resultado esperado: R$ 19,50 tri.</w:t>
+        <w:t xml:space="preserve">. Rótulo de categoria “Ativo total do sistema”. Resultado esperado: R$ 19,50 tri.</w:t>
       </w:r>
     </w:p>
     <w:p>
@@ -2066,13 +1613,7 @@
         <w:t xml:space="preserve">Qtd Instituições:</w:t>
       </w:r>
       <w:r>
-        <w:t xml:space="preserve"> </w:t>
-      </w:r>
-      <w:r>
-        <w:t xml:space="preserve">campo</w:t>
-      </w:r>
-      <w:r>
-        <w:t xml:space="preserve"> </w:t>
+        <w:t xml:space="preserve"> campo </w:t>
       </w:r>
       <w:r>
         <w:rPr>
@@ -2100,13 +1641,7 @@
         <w:t xml:space="preserve">ROE Médio:</w:t>
       </w:r>
       <w:r>
-        <w:t xml:space="preserve"> </w:t>
-      </w:r>
-      <w:r>
-        <w:t xml:space="preserve">campo</w:t>
-      </w:r>
-      <w:r>
-        <w:t xml:space="preserve"> </w:t>
+        <w:t xml:space="preserve"> campo </w:t>
       </w:r>
       <w:r>
         <w:rPr>
@@ -2115,22 +1650,7 @@
         <w:t xml:space="preserve">ROE Agregado</w:t>
       </w:r>
       <w:r>
-        <w:t xml:space="preserve">. Renomeie o título para</w:t>
-      </w:r>
-      <w:r>
-        <w:t xml:space="preserve"> </w:t>
-      </w:r>
-      <w:r>
-        <w:t xml:space="preserve">“</w:t>
-      </w:r>
-      <w:r>
-        <w:t xml:space="preserve">ROE agregado do semestre</w:t>
-      </w:r>
-      <w:r>
-        <w:t xml:space="preserve">”</w:t>
-      </w:r>
-      <w:r>
-        <w:t xml:space="preserve">. Esperado: 7,5%.</w:t>
+        <w:t xml:space="preserve">. Renomeie o título para “ROE agregado do semestre”. Esperado: 7,5%.</w:t>
       </w:r>
     </w:p>
     <w:p>
@@ -2149,13 +1669,7 @@
         <w:t xml:space="preserve">Qtd sem Agência:</w:t>
       </w:r>
       <w:r>
-        <w:t xml:space="preserve"> </w:t>
-      </w:r>
-      <w:r>
-        <w:t xml:space="preserve">campo</w:t>
-      </w:r>
-      <w:r>
-        <w:t xml:space="preserve"> </w:t>
+        <w:t xml:space="preserve"> campo </w:t>
       </w:r>
       <w:r>
         <w:rPr>
@@ -2164,25 +1678,7 @@
         <w:t xml:space="preserve">Qtd sem Agência</w:t>
       </w:r>
       <w:r>
-        <w:t xml:space="preserve">. Esperado: 756. Se preferir</w:t>
-      </w:r>
-      <w:r>
-        <w:t xml:space="preserve"> </w:t>
-      </w:r>
-      <w:r>
-        <w:t xml:space="preserve">“</w:t>
-      </w:r>
-      <w:r>
-        <w:t xml:space="preserve">digitais</w:t>
-      </w:r>
-      <w:r>
-        <w:t xml:space="preserve">”</w:t>
-      </w:r>
-      <w:r>
-        <w:t xml:space="preserve">, use</w:t>
-      </w:r>
-      <w:r>
-        <w:t xml:space="preserve"> </w:t>
+        <w:t xml:space="preserve">. Esperado: 756. Se preferir “digitais”, use </w:t>
       </w:r>
       <w:r>
         <w:rPr>
@@ -2191,25 +1687,7 @@
         <w:t xml:space="preserve">Qtd Digitais</w:t>
       </w:r>
       <w:r>
-        <w:t xml:space="preserve"> </w:t>
-      </w:r>
-      <w:r>
-        <w:t xml:space="preserve">(215) e renomeie o título para</w:t>
-      </w:r>
-      <w:r>
-        <w:t xml:space="preserve"> </w:t>
-      </w:r>
-      <w:r>
-        <w:t xml:space="preserve">“</w:t>
-      </w:r>
-      <w:r>
-        <w:t xml:space="preserve">Digitais (n1, n2, n4 com até 1 agência)</w:t>
-      </w:r>
-      <w:r>
-        <w:t xml:space="preserve">”</w:t>
-      </w:r>
-      <w:r>
-        <w:t xml:space="preserve">.</w:t>
+        <w:t xml:space="preserve"> (215) e renomeie o título para “Digitais (n1, n2, n4 com até 1 agência)”.</w:t>
       </w:r>
     </w:p>
     <w:p>
@@ -2239,10 +1717,7 @@
         <w:pStyle w:val="Compact"/>
       </w:pPr>
       <w:r>
-        <w:t xml:space="preserve">Insira</w:t>
-      </w:r>
-      <w:r>
-        <w:t xml:space="preserve"> </w:t>
+        <w:t xml:space="preserve">Insira </w:t>
       </w:r>
       <w:r>
         <w:rPr>
@@ -2252,10 +1727,7 @@
         <w:t xml:space="preserve">Gráfico de barras agrupadas</w:t>
       </w:r>
       <w:r>
-        <w:t xml:space="preserve"> </w:t>
-      </w:r>
-      <w:r>
-        <w:t xml:space="preserve">(horizontal).</w:t>
+        <w:t xml:space="preserve"> (horizontal).</w:t>
       </w:r>
     </w:p>
     <w:p>
@@ -2283,10 +1755,7 @@
         <w:t xml:space="preserve">ifdata[instituicao]</w:t>
       </w:r>
       <w:r>
-        <w:t xml:space="preserve">.</w:t>
-      </w:r>
-      <w:r>
-        <w:t xml:space="preserve"> </w:t>
+        <w:t xml:space="preserve">. </w:t>
       </w:r>
       <w:r>
         <w:rPr>
@@ -2317,10 +1786,7 @@
         <w:pStyle w:val="Compact"/>
       </w:pPr>
       <w:r>
-        <w:t xml:space="preserve">No painel</w:t>
-      </w:r>
-      <w:r>
-        <w:t xml:space="preserve"> </w:t>
+        <w:t xml:space="preserve">No painel </w:t>
       </w:r>
       <w:r>
         <w:rPr>
@@ -2330,10 +1796,7 @@
         <w:t xml:space="preserve">Filtros</w:t>
       </w:r>
       <w:r>
-        <w:t xml:space="preserve">, arraste</w:t>
-      </w:r>
-      <w:r>
-        <w:t xml:space="preserve"> </w:t>
+        <w:t xml:space="preserve">, arraste </w:t>
       </w:r>
       <w:r>
         <w:rPr>
@@ -2342,28 +1805,7 @@
         <w:t xml:space="preserve">instituicao</w:t>
       </w:r>
       <w:r>
-        <w:t xml:space="preserve"> </w:t>
-      </w:r>
-      <w:r>
-        <w:t xml:space="preserve">para</w:t>
-      </w:r>
-      <w:r>
-        <w:t xml:space="preserve"> </w:t>
-      </w:r>
-      <w:r>
-        <w:t xml:space="preserve">“</w:t>
-      </w:r>
-      <w:r>
-        <w:t xml:space="preserve">Filtros neste visual</w:t>
-      </w:r>
-      <w:r>
-        <w:t xml:space="preserve">”</w:t>
-      </w:r>
-      <w:r>
-        <w:t xml:space="preserve">, escolha</w:t>
-      </w:r>
-      <w:r>
-        <w:t xml:space="preserve"> </w:t>
+        <w:t xml:space="preserve"> para “Filtros neste visual”, escolha </w:t>
       </w:r>
       <w:r>
         <w:rPr>
@@ -2373,10 +1815,7 @@
         <w:t xml:space="preserve">Filtragem N Superior</w:t>
       </w:r>
       <w:r>
-        <w:t xml:space="preserve">, Mostrar itens: Superior, 10, Por valor:</w:t>
-      </w:r>
-      <w:r>
-        <w:t xml:space="preserve"> </w:t>
+        <w:t xml:space="preserve">, Mostrar itens: Superior, 10, Por valor: </w:t>
       </w:r>
       <w:r>
         <w:rPr>
@@ -2385,10 +1824,7 @@
         <w:t xml:space="preserve">Ativo Total</w:t>
       </w:r>
       <w:r>
-        <w:t xml:space="preserve">. Clique em</w:t>
-      </w:r>
-      <w:r>
-        <w:t xml:space="preserve"> </w:t>
+        <w:t xml:space="preserve">. Clique em </w:t>
       </w:r>
       <w:r>
         <w:rPr>
@@ -2410,10 +1846,7 @@
         <w:pStyle w:val="Compact"/>
       </w:pPr>
       <w:r>
-        <w:t xml:space="preserve">Ordene:</w:t>
-      </w:r>
-      <w:r>
-        <w:t xml:space="preserve"> </w:t>
+        <w:t xml:space="preserve">Ordene: </w:t>
       </w:r>
       <w:r>
         <w:rPr>
@@ -2435,10 +1868,7 @@
         <w:pStyle w:val="Compact"/>
       </w:pPr>
       <w:r>
-        <w:t xml:space="preserve">Barra do maior banco dominante:</w:t>
-      </w:r>
-      <w:r>
-        <w:t xml:space="preserve"> </w:t>
+        <w:t xml:space="preserve">Barra do maior banco dominante: </w:t>
       </w:r>
       <w:r>
         <w:rPr>
@@ -2448,31 +1878,7 @@
         <w:t xml:space="preserve">Formato &gt; Barras &gt; Cores &gt; fx (formatação condicional)</w:t>
       </w:r>
       <w:r>
-        <w:t xml:space="preserve"> </w:t>
-      </w:r>
-      <w:r>
-        <w:t xml:space="preserve">&gt; Formatar estilo</w:t>
-      </w:r>
-      <w:r>
-        <w:t xml:space="preserve"> </w:t>
-      </w:r>
-      <w:r>
-        <w:t xml:space="preserve">“</w:t>
-      </w:r>
-      <w:r>
-        <w:t xml:space="preserve">Valor do campo</w:t>
-      </w:r>
-      <w:r>
-        <w:t xml:space="preserve">”</w:t>
-      </w:r>
-      <w:r>
-        <w:t xml:space="preserve"> </w:t>
-      </w:r>
-      <w:r>
-        <w:t xml:space="preserve">&gt; Com base em:</w:t>
-      </w:r>
-      <w:r>
-        <w:t xml:space="preserve"> </w:t>
+        <w:t xml:space="preserve"> &gt; Formatar estilo “Valor do campo” &gt; Com base em: </w:t>
       </w:r>
       <w:r>
         <w:rPr>
@@ -2493,10 +1899,7 @@
         <w:pStyle w:val="Compact"/>
       </w:pPr>
       <w:r>
-        <w:t xml:space="preserve">Rótulos de dados ligados (formato</w:t>
-      </w:r>
-      <w:r>
-        <w:t xml:space="preserve"> </w:t>
+        <w:t xml:space="preserve">Rótulos de dados ligados (formato </w:t>
       </w:r>
       <w:r>
         <w:rPr>
@@ -2505,22 +1908,7 @@
         <w:t xml:space="preserve">#,0</w:t>
       </w:r>
       <w:r>
-        <w:t xml:space="preserve">), sem linhas de grade, eixo X oculto, título</w:t>
-      </w:r>
-      <w:r>
-        <w:t xml:space="preserve"> </w:t>
-      </w:r>
-      <w:r>
-        <w:t xml:space="preserve">“</w:t>
-      </w:r>
-      <w:r>
-        <w:t xml:space="preserve">Top 10 instituições por ativo (R$ bi)</w:t>
-      </w:r>
-      <w:r>
-        <w:t xml:space="preserve">”</w:t>
-      </w:r>
-      <w:r>
-        <w:t xml:space="preserve">.</w:t>
+        <w:t xml:space="preserve">), sem linhas de grade, eixo X oculto, título “Top 10 instituições por ativo (R$ bi)”.</w:t>
       </w:r>
     </w:p>
     <w:p>
@@ -2550,10 +1938,7 @@
         <w:pStyle w:val="Compact"/>
       </w:pPr>
       <w:r>
-        <w:t xml:space="preserve">Insira</w:t>
-      </w:r>
-      <w:r>
-        <w:t xml:space="preserve"> </w:t>
+        <w:t xml:space="preserve">Insira </w:t>
       </w:r>
       <w:r>
         <w:rPr>
@@ -2591,10 +1976,7 @@
         <w:t xml:space="preserve">ifdata[tipo_controle]</w:t>
       </w:r>
       <w:r>
-        <w:t xml:space="preserve">.</w:t>
-      </w:r>
-      <w:r>
-        <w:t xml:space="preserve"> </w:t>
+        <w:t xml:space="preserve">. </w:t>
       </w:r>
       <w:r>
         <w:rPr>
@@ -2632,13 +2014,7 @@
         <w:t xml:space="preserve">Formato &gt; Fatias &gt; Cores:</w:t>
       </w:r>
       <w:r>
-        <w:t xml:space="preserve"> </w:t>
-      </w:r>
-      <w:r>
-        <w:t xml:space="preserve">Público</w:t>
-      </w:r>
-      <w:r>
-        <w:t xml:space="preserve"> </w:t>
+        <w:t xml:space="preserve"> Público </w:t>
       </w:r>
       <w:r>
         <w:rPr>
@@ -2647,10 +2023,7 @@
         <w:t xml:space="preserve">#1F3A6E</w:t>
       </w:r>
       <w:r>
-        <w:t xml:space="preserve">, Privado Nacional</w:t>
-      </w:r>
-      <w:r>
-        <w:t xml:space="preserve"> </w:t>
+        <w:t xml:space="preserve">, Privado Nacional </w:t>
       </w:r>
       <w:r>
         <w:rPr>
@@ -2659,10 +2032,7 @@
         <w:t xml:space="preserve">#2A9D8F</w:t>
       </w:r>
       <w:r>
-        <w:t xml:space="preserve">, Privado Estrangeiro</w:t>
-      </w:r>
-      <w:r>
-        <w:t xml:space="preserve"> </w:t>
+        <w:t xml:space="preserve">, Privado Estrangeiro </w:t>
       </w:r>
       <w:r>
         <w:rPr>
@@ -2671,10 +2041,7 @@
         <w:t xml:space="preserve">#9AD3CB</w:t>
       </w:r>
       <w:r>
-        <w:t xml:space="preserve"> </w:t>
-      </w:r>
-      <w:r>
-        <w:t xml:space="preserve">(uma cor para o público e duas para os privados).</w:t>
+        <w:t xml:space="preserve"> (uma cor para o público e duas para os privados).</w:t>
       </w:r>
     </w:p>
     <w:p>
@@ -2693,13 +2060,7 @@
         <w:t xml:space="preserve">Rótulos de detalhes:</w:t>
       </w:r>
       <w:r>
-        <w:t xml:space="preserve"> </w:t>
-      </w:r>
-      <w:r>
-        <w:t xml:space="preserve">exibir Categoria e Porcentagem do total. Para usar a medida, arraste</w:t>
-      </w:r>
-      <w:r>
-        <w:t xml:space="preserve"> </w:t>
+        <w:t xml:space="preserve"> exibir Categoria e Porcentagem do total. Para usar a medida, arraste </w:t>
       </w:r>
       <w:r>
         <w:rPr>
@@ -2708,13 +2069,7 @@
         <w:t xml:space="preserve">Ativo % do Total</w:t>
       </w:r>
       <w:r>
-        <w:t xml:space="preserve"> </w:t>
-      </w:r>
-      <w:r>
-        <w:t xml:space="preserve">para</w:t>
-      </w:r>
-      <w:r>
-        <w:t xml:space="preserve"> </w:t>
+        <w:t xml:space="preserve"> para </w:t>
       </w:r>
       <w:r>
         <w:rPr>
@@ -2758,10 +2113,7 @@
         <w:pStyle w:val="Compact"/>
       </w:pPr>
       <w:r>
-        <w:t xml:space="preserve">Insira</w:t>
-      </w:r>
-      <w:r>
-        <w:t xml:space="preserve"> </w:t>
+        <w:t xml:space="preserve">Insira </w:t>
       </w:r>
       <w:r>
         <w:rPr>
@@ -2771,10 +2123,7 @@
         <w:t xml:space="preserve">Tabela</w:t>
       </w:r>
       <w:r>
-        <w:t xml:space="preserve">. Colunas, nesta ordem:</w:t>
-      </w:r>
-      <w:r>
-        <w:t xml:space="preserve"> </w:t>
+        <w:t xml:space="preserve">. Colunas, nesta ordem: </w:t>
       </w:r>
       <w:r>
         <w:rPr>
@@ -2783,10 +2132,7 @@
         <w:t xml:space="preserve">instituicao</w:t>
       </w:r>
       <w:r>
-        <w:t xml:space="preserve">,</w:t>
-      </w:r>
-      <w:r>
-        <w:t xml:space="preserve"> </w:t>
+        <w:t xml:space="preserve">, </w:t>
       </w:r>
       <w:r>
         <w:rPr>
@@ -2795,10 +2141,7 @@
         <w:t xml:space="preserve">tipo_controle</w:t>
       </w:r>
       <w:r>
-        <w:t xml:space="preserve">,</w:t>
-      </w:r>
-      <w:r>
-        <w:t xml:space="preserve"> </w:t>
+        <w:t xml:space="preserve">, </w:t>
       </w:r>
       <w:r>
         <w:rPr>
@@ -2807,10 +2150,7 @@
         <w:t xml:space="preserve">segmento</w:t>
       </w:r>
       <w:r>
-        <w:t xml:space="preserve">,</w:t>
-      </w:r>
-      <w:r>
-        <w:t xml:space="preserve"> </w:t>
+        <w:t xml:space="preserve">, </w:t>
       </w:r>
       <w:r>
         <w:rPr>
@@ -2819,10 +2159,7 @@
         <w:t xml:space="preserve">uf</w:t>
       </w:r>
       <w:r>
-        <w:t xml:space="preserve">,</w:t>
-      </w:r>
-      <w:r>
-        <w:t xml:space="preserve"> </w:t>
+        <w:t xml:space="preserve">, </w:t>
       </w:r>
       <w:r>
         <w:rPr>
@@ -2831,10 +2168,7 @@
         <w:t xml:space="preserve">Ativo Total (R$ bi)</w:t>
       </w:r>
       <w:r>
-        <w:t xml:space="preserve">,</w:t>
-      </w:r>
-      <w:r>
-        <w:t xml:space="preserve"> </w:t>
+        <w:t xml:space="preserve">, </w:t>
       </w:r>
       <w:r>
         <w:rPr>
@@ -2843,10 +2177,7 @@
         <w:t xml:space="preserve">Índice Crédito/Ativo</w:t>
       </w:r>
       <w:r>
-        <w:t xml:space="preserve">,</w:t>
-      </w:r>
-      <w:r>
-        <w:t xml:space="preserve"> </w:t>
+        <w:t xml:space="preserve">, </w:t>
       </w:r>
       <w:r>
         <w:rPr>
@@ -2867,10 +2198,7 @@
         <w:pStyle w:val="Compact"/>
       </w:pPr>
       <w:r>
-        <w:t xml:space="preserve">Classifique por</w:t>
-      </w:r>
-      <w:r>
-        <w:t xml:space="preserve"> </w:t>
+        <w:t xml:space="preserve">Classifique por </w:t>
       </w:r>
       <w:r>
         <w:rPr>
@@ -2879,10 +2207,7 @@
         <w:t xml:space="preserve">Ativo Total (R$ bi)</w:t>
       </w:r>
       <w:r>
-        <w:t xml:space="preserve"> </w:t>
-      </w:r>
-      <w:r>
-        <w:t xml:space="preserve">decrescente (clique no cabeçalho).</w:t>
+        <w:t xml:space="preserve"> decrescente (clique no cabeçalho).</w:t>
       </w:r>
     </w:p>
     <w:p>
@@ -2901,13 +2226,7 @@
         <w:t xml:space="preserve">Formato &gt; Elementos de célula &gt; Barras de dados</w:t>
       </w:r>
       <w:r>
-        <w:t xml:space="preserve"> </w:t>
-      </w:r>
-      <w:r>
-        <w:t xml:space="preserve">na coluna de ativo. Cabeçalho navy</w:t>
-      </w:r>
-      <w:r>
-        <w:t xml:space="preserve"> </w:t>
+        <w:t xml:space="preserve"> na coluna de ativo. Cabeçalho navy </w:t>
       </w:r>
       <w:r>
         <w:rPr>
@@ -2916,13 +2235,7 @@
         <w:t xml:space="preserve">#243F73</w:t>
       </w:r>
       <w:r>
-        <w:t xml:space="preserve"> </w:t>
-      </w:r>
-      <w:r>
-        <w:t xml:space="preserve">com texto branco e linhas alternadas</w:t>
-      </w:r>
-      <w:r>
-        <w:t xml:space="preserve"> </w:t>
+        <w:t xml:space="preserve"> com texto branco e linhas alternadas </w:t>
       </w:r>
       <w:r>
         <w:rPr>
@@ -2943,10 +2256,7 @@
         <w:pStyle w:val="Compact"/>
       </w:pPr>
       <w:r>
-        <w:t xml:space="preserve">Ative a pesquisa:</w:t>
-      </w:r>
-      <w:r>
-        <w:t xml:space="preserve"> </w:t>
+        <w:t xml:space="preserve">Ative a pesquisa: </w:t>
       </w:r>
       <w:r>
         <w:rPr>
@@ -2985,13 +2295,7 @@
         <w:t xml:space="preserve">Segmento:</w:t>
       </w:r>
       <w:r>
-        <w:t xml:space="preserve"> </w:t>
-      </w:r>
-      <w:r>
-        <w:t xml:space="preserve">insira</w:t>
-      </w:r>
-      <w:r>
-        <w:t xml:space="preserve"> </w:t>
+        <w:t xml:space="preserve"> insira </w:t>
       </w:r>
       <w:r>
         <w:rPr>
@@ -3001,10 +2305,7 @@
         <w:t xml:space="preserve">Segmentação</w:t>
       </w:r>
       <w:r>
-        <w:t xml:space="preserve">, campo</w:t>
-      </w:r>
-      <w:r>
-        <w:t xml:space="preserve"> </w:t>
+        <w:t xml:space="preserve">, campo </w:t>
       </w:r>
       <w:r>
         <w:rPr>
@@ -3013,40 +2314,7 @@
         <w:t xml:space="preserve">ifdata[segmento]</w:t>
       </w:r>
       <w:r>
-        <w:t xml:space="preserve">. Estilo Lista ou Bloco, com S1 a S5 (desmarque</w:t>
-      </w:r>
-      <w:r>
-        <w:t xml:space="preserve"> </w:t>
-      </w:r>
-      <w:r>
-        <w:t xml:space="preserve">“</w:t>
-      </w:r>
-      <w:r>
-        <w:t xml:space="preserve">NI</w:t>
-      </w:r>
-      <w:r>
-        <w:t xml:space="preserve">”</w:t>
-      </w:r>
-      <w:r>
-        <w:t xml:space="preserve"> </w:t>
-      </w:r>
-      <w:r>
-        <w:t xml:space="preserve">se não quiser ver as sem dado). Título</w:t>
-      </w:r>
-      <w:r>
-        <w:t xml:space="preserve"> </w:t>
-      </w:r>
-      <w:r>
-        <w:t xml:space="preserve">“</w:t>
-      </w:r>
-      <w:r>
-        <w:t xml:space="preserve">Segmento</w:t>
-      </w:r>
-      <w:r>
-        <w:t xml:space="preserve">”</w:t>
-      </w:r>
-      <w:r>
-        <w:t xml:space="preserve">.</w:t>
+        <w:t xml:space="preserve">. Estilo Lista ou Bloco, com S1 a S5 (desmarque “NI” se não quiser ver as sem dado). Título “Segmento”.</w:t>
       </w:r>
     </w:p>
     <w:p>
@@ -3065,13 +2333,7 @@
         <w:t xml:space="preserve">UF:</w:t>
       </w:r>
       <w:r>
-        <w:t xml:space="preserve"> </w:t>
-      </w:r>
-      <w:r>
-        <w:t xml:space="preserve">segmentação, campo</w:t>
-      </w:r>
-      <w:r>
-        <w:t xml:space="preserve"> </w:t>
+        <w:t xml:space="preserve"> segmentação, campo </w:t>
       </w:r>
       <w:r>
         <w:rPr>
@@ -3080,10 +2342,7 @@
         <w:t xml:space="preserve">ifdata[uf]</w:t>
       </w:r>
       <w:r>
-        <w:t xml:space="preserve">. Estilo</w:t>
-      </w:r>
-      <w:r>
-        <w:t xml:space="preserve"> </w:t>
+        <w:t xml:space="preserve">. Estilo </w:t>
       </w:r>
       <w:r>
         <w:rPr>
@@ -3093,40 +2352,7 @@
         <w:t xml:space="preserve">Lista suspensa</w:t>
       </w:r>
       <w:r>
-        <w:t xml:space="preserve">, pesquisa ativa,</w:t>
-      </w:r>
-      <w:r>
-        <w:t xml:space="preserve"> </w:t>
-      </w:r>
-      <w:r>
-        <w:t xml:space="preserve">“</w:t>
-      </w:r>
-      <w:r>
-        <w:t xml:space="preserve">Selecionar tudo</w:t>
-      </w:r>
-      <w:r>
-        <w:t xml:space="preserve">”</w:t>
-      </w:r>
-      <w:r>
-        <w:t xml:space="preserve"> </w:t>
-      </w:r>
-      <w:r>
-        <w:t xml:space="preserve">ligado. Título</w:t>
-      </w:r>
-      <w:r>
-        <w:t xml:space="preserve"> </w:t>
-      </w:r>
-      <w:r>
-        <w:t xml:space="preserve">“</w:t>
-      </w:r>
-      <w:r>
-        <w:t xml:space="preserve">UF da sede</w:t>
-      </w:r>
-      <w:r>
-        <w:t xml:space="preserve">”</w:t>
-      </w:r>
-      <w:r>
-        <w:t xml:space="preserve">.</w:t>
+        <w:t xml:space="preserve">, pesquisa ativa, “Selecionar tudo” ligado. Título “UF da sede”.</w:t>
       </w:r>
     </w:p>
     <w:p>
@@ -3157,13 +2383,7 @@
         <w:t xml:space="preserve">O segmentador filtra todos os visuais:</w:t>
       </w:r>
       <w:r>
-        <w:t xml:space="preserve"> </w:t>
-      </w:r>
-      <w:r>
-        <w:t xml:space="preserve">confirme em</w:t>
-      </w:r>
-      <w:r>
-        <w:t xml:space="preserve"> </w:t>
+        <w:t xml:space="preserve"> confirme em </w:t>
       </w:r>
       <w:r>
         <w:rPr>
@@ -3173,25 +2393,7 @@
         <w:t xml:space="preserve">Formato &gt; Editar interações</w:t>
       </w:r>
       <w:r>
-        <w:t xml:space="preserve"> </w:t>
-      </w:r>
-      <w:r>
-        <w:t xml:space="preserve">que, com a segmentação selecionada, cada um dos outros visuais está com o ícone de filtro (e não o de</w:t>
-      </w:r>
-      <w:r>
-        <w:t xml:space="preserve"> </w:t>
-      </w:r>
-      <w:r>
-        <w:t xml:space="preserve">“</w:t>
-      </w:r>
-      <w:r>
-        <w:t xml:space="preserve">nenhum</w:t>
-      </w:r>
-      <w:r>
-        <w:t xml:space="preserve">”</w:t>
-      </w:r>
-      <w:r>
-        <w:t xml:space="preserve">). O padrão do Power BI já é filtrar.</w:t>
+        <w:t xml:space="preserve"> que, com a segmentação selecionada, cada um dos outros visuais está com o ícone de filtro (e não o de “nenhum”). O padrão do Power BI já é filtrar.</w:t>
       </w:r>
     </w:p>
     <w:p>
@@ -3203,10 +2405,7 @@
         <w:pStyle w:val="Compact"/>
       </w:pPr>
       <w:r>
-        <w:t xml:space="preserve">Para refletir nas duas páginas:</w:t>
-      </w:r>
-      <w:r>
-        <w:t xml:space="preserve"> </w:t>
+        <w:t xml:space="preserve">Para refletir nas duas páginas: </w:t>
       </w:r>
       <w:r>
         <w:rPr>
@@ -3216,40 +2415,7 @@
         <w:t xml:space="preserve">Exibir &gt; Sincronizar segmentações</w:t>
       </w:r>
       <w:r>
-        <w:t xml:space="preserve">, marque as duas páginas em</w:t>
-      </w:r>
-      <w:r>
-        <w:t xml:space="preserve"> </w:t>
-      </w:r>
-      <w:r>
-        <w:t xml:space="preserve">“</w:t>
-      </w:r>
-      <w:r>
-        <w:t xml:space="preserve">Sincronizar</w:t>
-      </w:r>
-      <w:r>
-        <w:t xml:space="preserve">”</w:t>
-      </w:r>
-      <w:r>
-        <w:t xml:space="preserve"> </w:t>
-      </w:r>
-      <w:r>
-        <w:t xml:space="preserve">e</w:t>
-      </w:r>
-      <w:r>
-        <w:t xml:space="preserve"> </w:t>
-      </w:r>
-      <w:r>
-        <w:t xml:space="preserve">“</w:t>
-      </w:r>
-      <w:r>
-        <w:t xml:space="preserve">Visível</w:t>
-      </w:r>
-      <w:r>
-        <w:t xml:space="preserve">”</w:t>
-      </w:r>
-      <w:r>
-        <w:t xml:space="preserve">.</w:t>
+        <w:t xml:space="preserve">, marque as duas páginas em “Sincronizar” e “Visível”.</w:t>
       </w:r>
     </w:p>
     <w:bookmarkEnd w:id="27"/>
@@ -3289,10 +2455,7 @@
         <w:pStyle w:val="Compact"/>
       </w:pPr>
       <w:r>
-        <w:t xml:space="preserve">Insira</w:t>
-      </w:r>
-      <w:r>
-        <w:t xml:space="preserve"> </w:t>
+        <w:t xml:space="preserve">Insira </w:t>
       </w:r>
       <w:r>
         <w:rPr>
@@ -3330,10 +2493,7 @@
         <w:t xml:space="preserve">ifdata[segmento]</w:t>
       </w:r>
       <w:r>
-        <w:t xml:space="preserve">.</w:t>
-      </w:r>
-      <w:r>
-        <w:t xml:space="preserve"> </w:t>
+        <w:t xml:space="preserve">. </w:t>
       </w:r>
       <w:r>
         <w:rPr>
@@ -3364,10 +2524,7 @@
         <w:pStyle w:val="Compact"/>
       </w:pPr>
       <w:r>
-        <w:t xml:space="preserve">Filtro no visual:</w:t>
-      </w:r>
-      <w:r>
-        <w:t xml:space="preserve"> </w:t>
+        <w:t xml:space="preserve">Filtro no visual: </w:t>
       </w:r>
       <w:r>
         <w:rPr>
@@ -3376,28 +2533,7 @@
         <w:t xml:space="preserve">segmento</w:t>
       </w:r>
       <w:r>
-        <w:t xml:space="preserve"> </w:t>
-      </w:r>
-      <w:r>
-        <w:t xml:space="preserve">diferente de</w:t>
-      </w:r>
-      <w:r>
-        <w:t xml:space="preserve"> </w:t>
-      </w:r>
-      <w:r>
-        <w:t xml:space="preserve">“</w:t>
-      </w:r>
-      <w:r>
-        <w:t xml:space="preserve">NI</w:t>
-      </w:r>
-      <w:r>
-        <w:t xml:space="preserve">”</w:t>
-      </w:r>
-      <w:r>
-        <w:t xml:space="preserve"> </w:t>
-      </w:r>
-      <w:r>
-        <w:t xml:space="preserve">(Filtros &gt; segmento &gt; desmarcar NI).</w:t>
+        <w:t xml:space="preserve"> diferente de “NI” (Filtros &gt; segmento &gt; desmarcar NI).</w:t>
       </w:r>
     </w:p>
     <w:p>
@@ -3409,22 +2545,7 @@
         <w:pStyle w:val="Compact"/>
       </w:pPr>
       <w:r>
-        <w:t xml:space="preserve">Rótulos de dados em porcentagem, uma cor única em navy. Título</w:t>
-      </w:r>
-      <w:r>
-        <w:t xml:space="preserve"> </w:t>
-      </w:r>
-      <w:r>
-        <w:t xml:space="preserve">“</w:t>
-      </w:r>
-      <w:r>
-        <w:t xml:space="preserve">ROE agregado do semestre por segmento (Lucro ÷ PL)</w:t>
-      </w:r>
-      <w:r>
-        <w:t xml:space="preserve">”</w:t>
-      </w:r>
-      <w:r>
-        <w:t xml:space="preserve">.</w:t>
+        <w:t xml:space="preserve">Rótulos de dados em porcentagem, uma cor única em navy. Título “ROE agregado do semestre por segmento (Lucro ÷ PL)”.</w:t>
       </w:r>
     </w:p>
     <w:p>
@@ -3436,10 +2557,7 @@
         <w:pStyle w:val="Compact"/>
       </w:pPr>
       <w:r>
-        <w:t xml:space="preserve">Linha de referência:</w:t>
-      </w:r>
-      <w:r>
-        <w:t xml:space="preserve"> </w:t>
+        <w:t xml:space="preserve">Linha de referência: </w:t>
       </w:r>
       <w:r>
         <w:rPr>
@@ -3449,10 +2567,7 @@
         <w:t xml:space="preserve">Análise &gt; Linha média</w:t>
       </w:r>
       <w:r>
-        <w:t xml:space="preserve">, ou adicione uma linha constante com o</w:t>
-      </w:r>
-      <w:r>
-        <w:t xml:space="preserve"> </w:t>
+        <w:t xml:space="preserve">, ou adicione uma linha constante com o </w:t>
       </w:r>
       <w:r>
         <w:rPr>
@@ -3461,10 +2576,7 @@
         <w:t xml:space="preserve">ROE Agregado</w:t>
       </w:r>
       <w:r>
-        <w:t xml:space="preserve"> </w:t>
-      </w:r>
-      <w:r>
-        <w:t xml:space="preserve">geral.</w:t>
+        <w:t xml:space="preserve"> geral.</w:t>
       </w:r>
     </w:p>
     <w:p>
@@ -3506,10 +2618,7 @@
         <w:pStyle w:val="Compact"/>
       </w:pPr>
       <w:r>
-        <w:t xml:space="preserve">Insira</w:t>
-      </w:r>
-      <w:r>
-        <w:t xml:space="preserve"> </w:t>
+        <w:t xml:space="preserve">Insira </w:t>
       </w:r>
       <w:r>
         <w:rPr>
@@ -3547,17 +2656,33 @@
         <w:t xml:space="preserve">instituicao</w:t>
       </w:r>
       <w:r>
-        <w:t xml:space="preserve">.</w:t>
+        <w:t xml:space="preserve">. </w:t>
+      </w:r>
+      <w:r>
+        <w:rPr>
+          <w:bCs/>
+          <w:b/>
+        </w:rPr>
+        <w:t xml:space="preserve">Eixo X:</w:t>
       </w:r>
       <w:r>
         <w:t xml:space="preserve"> </w:t>
       </w:r>
       <w:r>
         <w:rPr>
-          <w:bCs/>
-          <w:b/>
-        </w:rPr>
-        <w:t xml:space="preserve">Eixo X:</w:t>
+          <w:rStyle w:val="VerbatimChar"/>
+        </w:rPr>
+        <w:t xml:space="preserve">Ativo Total (R$ bi)</w:t>
+      </w:r>
+      <w:r>
+        <w:t xml:space="preserve">. </w:t>
+      </w:r>
+      <w:r>
+        <w:rPr>
+          <w:bCs/>
+          <w:b/>
+        </w:rPr>
+        <w:t xml:space="preserve">Eixo Y:</w:t>
       </w:r>
       <w:r>
         <w:t xml:space="preserve"> </w:t>
@@ -3566,38 +2691,10 @@
         <w:rPr>
           <w:rStyle w:val="VerbatimChar"/>
         </w:rPr>
-        <w:t xml:space="preserve">Ativo Total (R$ bi)</w:t>
-      </w:r>
-      <w:r>
-        <w:t xml:space="preserve">.</w:t>
-      </w:r>
-      <w:r>
-        <w:t xml:space="preserve"> </w:t>
-      </w:r>
-      <w:r>
-        <w:rPr>
-          <w:bCs/>
-          <w:b/>
-        </w:rPr>
-        <w:t xml:space="preserve">Eixo Y:</w:t>
-      </w:r>
-      <w:r>
-        <w:t xml:space="preserve"> </w:t>
-      </w:r>
-      <w:r>
-        <w:rPr>
-          <w:rStyle w:val="VerbatimChar"/>
-        </w:rPr>
         <w:t xml:space="preserve">Índice Crédito/Ativo</w:t>
       </w:r>
       <w:r>
-        <w:t xml:space="preserve"> </w:t>
-      </w:r>
-      <w:r>
-        <w:t xml:space="preserve">(é o</w:t>
-      </w:r>
-      <w:r>
-        <w:t xml:space="preserve"> </w:t>
+        <w:t xml:space="preserve"> (é o </w:t>
       </w:r>
       <w:r>
         <w:rPr>
@@ -3606,10 +2703,7 @@
         <w:t xml:space="preserve">DIVIDE(crédito, ativo)</w:t>
       </w:r>
       <w:r>
-        <w:t xml:space="preserve">).</w:t>
-      </w:r>
-      <w:r>
-        <w:t xml:space="preserve"> </w:t>
+        <w:t xml:space="preserve">). </w:t>
       </w:r>
       <w:r>
         <w:rPr>
@@ -3647,10 +2741,7 @@
         <w:t xml:space="preserve">Formato &gt; Eixo X &gt; Tipo de escala: Log.</w:t>
       </w:r>
       <w:r>
-        <w:t xml:space="preserve"> </w:t>
-      </w:r>
-      <w:r>
-        <w:t xml:space="preserve">O ativo é muito concentrado (mediana de R$ 293 milhões contra R$ 2,46 tri do maior), e sem escala logarítmica quase todos os pontos se acumulam no canto.</w:t>
+        <w:t xml:space="preserve"> O ativo é muito concentrado (mediana de R$ 293 milhões contra R$ 2,46 tri do maior), e sem escala logarítmica quase todos os pontos se acumulam no canto.</w:t>
       </w:r>
     </w:p>
     <w:p>
@@ -3662,10 +2753,7 @@
         <w:pStyle w:val="Compact"/>
       </w:pPr>
       <w:r>
-        <w:t xml:space="preserve">Eixo Y em porcentagem. Opcional:</w:t>
-      </w:r>
-      <w:r>
-        <w:t xml:space="preserve"> </w:t>
+        <w:t xml:space="preserve">Eixo Y em porcentagem. Opcional: </w:t>
       </w:r>
       <w:r>
         <w:rPr>
@@ -3675,13 +2763,7 @@
         <w:t xml:space="preserve">Tamanho</w:t>
       </w:r>
       <w:r>
-        <w:t xml:space="preserve"> </w:t>
-      </w:r>
-      <w:r>
-        <w:t xml:space="preserve">=</w:t>
-      </w:r>
-      <w:r>
-        <w:t xml:space="preserve"> </w:t>
+        <w:t xml:space="preserve"> = </w:t>
       </w:r>
       <w:r>
         <w:rPr>
@@ -3702,10 +2784,7 @@
         <w:pStyle w:val="Compact"/>
       </w:pPr>
       <w:r>
-        <w:t xml:space="preserve">Em</w:t>
-      </w:r>
-      <w:r>
-        <w:t xml:space="preserve"> </w:t>
+        <w:t xml:space="preserve">Em </w:t>
       </w:r>
       <w:r>
         <w:rPr>
@@ -3715,10 +2794,7 @@
         <w:t xml:space="preserve">Dica de ferramenta</w:t>
       </w:r>
       <w:r>
-        <w:t xml:space="preserve">, inclua</w:t>
-      </w:r>
-      <w:r>
-        <w:t xml:space="preserve"> </w:t>
+        <w:t xml:space="preserve">, inclua </w:t>
       </w:r>
       <w:r>
         <w:rPr>
@@ -3727,10 +2803,7 @@
         <w:t xml:space="preserve">Carteira de Crédito</w:t>
       </w:r>
       <w:r>
-        <w:t xml:space="preserve">,</w:t>
-      </w:r>
-      <w:r>
-        <w:t xml:space="preserve"> </w:t>
+        <w:t xml:space="preserve">, </w:t>
       </w:r>
       <w:r>
         <w:rPr>
@@ -3739,13 +2812,7 @@
         <w:t xml:space="preserve">ROE Agregado</w:t>
       </w:r>
       <w:r>
-        <w:t xml:space="preserve"> </w:t>
-      </w:r>
-      <w:r>
-        <w:t xml:space="preserve">e</w:t>
-      </w:r>
-      <w:r>
-        <w:t xml:space="preserve"> </w:t>
+        <w:t xml:space="preserve"> e </w:t>
       </w:r>
       <w:r>
         <w:rPr>
@@ -4096,7 +3163,7 @@
         <w:pStyle w:val="Heading1"/>
       </w:pPr>
       <w:r>
-        <w:t xml:space="preserve">7. Limitações desta entrega</w:t>
+        <w:t xml:space="preserve">7. Status e limitações</w:t>
       </w:r>
     </w:p>
     <w:p>
@@ -4104,20 +3171,35 @@
         <w:pStyle w:val="FirstParagraph"/>
       </w:pPr>
       <w:r>
-        <w:t xml:space="preserve">Calculei todos os valores esperados diretamente sobre a planilha, mas</w:t>
-      </w:r>
-      <w:r>
-        <w:t xml:space="preserve"> </w:t>
-      </w:r>
-      <w:r>
-        <w:rPr>
-          <w:bCs/>
-          <w:b/>
-        </w:rPr>
-        <w:t xml:space="preserve">não executei o arquivo no Power BI Desktop</w:t>
-      </w:r>
-      <w:r>
-        <w:t xml:space="preserve">. O M e o DAX seguem a sintaxe padrão e usam os nomes de colunas definidos no script, mas rode a validação acima antes de apresentar. O segmento S1 a S5 é uma aproximação, não a classificação oficial do Banco Central.</w:t>
+        <w:t xml:space="preserve">O painel foi construído em </w:t>
+      </w:r>
+      <w:r>
+        <w:rPr>
+          <w:rStyle w:val="VerbatimChar"/>
+        </w:rPr>
+        <w:t xml:space="preserve">M5_Dashboard_IFdata.pbix</w:t>
+      </w:r>
+      <w:r>
+        <w:t xml:space="preserve"> e </w:t>
+      </w:r>
+      <w:r>
+        <w:rPr>
+          <w:bCs/>
+          <w:b/>
+        </w:rPr>
+        <w:t xml:space="preserve">conferido contra o checklist acima</w:t>
+      </w:r>
+      <w:r>
+        <w:t xml:space="preserve">: ativo de R$ 19,50 tri, 1.622 instituições, ROE agregado de 7,52%, 756 instituições sem agência, 215 digitais, 52% do ativo nas 5 maiores e rosca com Privado Nacional 50,07%, Público 32,78% e Privado Estrangeiro 17,15%. O ROE agregado por segmento ficou em S1 7,00%, S2 8,84%, S3 7,41%, S4 5,81% e S5 5,89%. A exportação em PDF (</w:t>
+      </w:r>
+      <w:r>
+        <w:rPr>
+          <w:rStyle w:val="VerbatimChar"/>
+        </w:rPr>
+        <w:t xml:space="preserve">M5_Dashboard_IFdata.pdf</w:t>
+      </w:r>
+      <w:r>
+        <w:t xml:space="preserve">) e os prints das duas páginas estão na mesma pasta. A publicação na Web pelo Power BI Service não está liberada na conta usada, por isso o portfólio mostra o painel pelo PDF e pelos prints. O segmento S1 a S5 continua sendo uma aproximação, não a classificação oficial do Banco Central.</w:t>
       </w:r>
     </w:p>
     <w:bookmarkEnd w:id="33"/>

</xml_diff>